<commit_message>
Modificación menor de trigger, eliminación del campo versión en compose y modificaciones menores en documentación inicial
</commit_message>
<xml_diff>
--- a/docs/URS_DIRA_Libro_Estupefacientes.docx
+++ b/docs/URS_DIRA_Libro_Estupefacientes.docx
@@ -388,15 +388,7 @@
                 <w:sz w:val="19"/>
                 <w:lang w:val="es-ES"/>
               </w:rPr>
-              <w:t>Preaprobación</w:t>
-            </w:r>
-            <w:r>
-              <w:rPr>
-                <w:rFonts w:ascii="Arial" w:hAnsi="Arial"/>
-                <w:sz w:val="19"/>
-                <w:lang w:val="es-ES"/>
-              </w:rPr>
-              <w:t xml:space="preserve"> de alcance normativo previo a arquitectura y modelado SQL</w:t>
+              <w:t>Preaprobación de alcance normativo previo a arquitectura y modelado SQL</w:t>
             </w:r>
           </w:p>
         </w:tc>
@@ -501,8 +493,19 @@
           <w:color w:val="5C768D"/>
           <w:sz w:val="26"/>
         </w:rPr>
-        <w:t xml:space="preserve"> Sanitaria de Estupefacientes</w:t>
+        <w:t xml:space="preserve"> Sanitaria de </w:t>
       </w:r>
+      <w:proofErr w:type="spellStart"/>
+      <w:r>
+        <w:rPr>
+          <w:rFonts w:ascii="Arial" w:hAnsi="Arial"/>
+          <w:b/>
+          <w:color w:val="5C768D"/>
+          <w:sz w:val="26"/>
+        </w:rPr>
+        <w:t>Estupefacientes</w:t>
+      </w:r>
+      <w:proofErr w:type="spellEnd"/>
     </w:p>
     <w:p>
       <w:pPr>
@@ -5119,13 +5122,6 @@
                 <w:rFonts w:ascii="Arial" w:hAnsi="Arial"/>
                 <w:sz w:val="17"/>
               </w:rPr>
-              <w:t>Alessandro</w:t>
-            </w:r>
-            <w:r>
-              <w:rPr>
-                <w:rFonts w:ascii="Arial" w:hAnsi="Arial"/>
-                <w:sz w:val="17"/>
-              </w:rPr>
               <w:br/>
               <w:t>Desarrollador / Técnico GxP</w:t>
             </w:r>
@@ -5183,13 +5179,41 @@
             <w:pPr>
               <w:spacing w:after="40"/>
             </w:pPr>
+            <w:proofErr w:type="spellStart"/>
             <w:r>
               <w:rPr>
                 <w:rFonts w:ascii="Arial" w:hAnsi="Arial"/>
                 <w:b/>
                 <w:sz w:val="17"/>
               </w:rPr>
-              <w:t>Aprobado por (Calidad / Reglamentarios):</w:t>
+              <w:t>Aprobado</w:t>
+            </w:r>
+            <w:proofErr w:type="spellEnd"/>
+            <w:r>
+              <w:rPr>
+                <w:rFonts w:ascii="Arial" w:hAnsi="Arial"/>
+                <w:b/>
+                <w:sz w:val="17"/>
+              </w:rPr>
+              <w:t xml:space="preserve"> </w:t>
+            </w:r>
+            <w:proofErr w:type="spellStart"/>
+            <w:r>
+              <w:rPr>
+                <w:rFonts w:ascii="Arial" w:hAnsi="Arial"/>
+                <w:b/>
+                <w:sz w:val="17"/>
+              </w:rPr>
+              <w:t>por</w:t>
+            </w:r>
+            <w:proofErr w:type="spellEnd"/>
+            <w:r>
+              <w:rPr>
+                <w:rFonts w:ascii="Arial" w:hAnsi="Arial"/>
+                <w:b/>
+                <w:sz w:val="17"/>
+              </w:rPr>
+              <w:t xml:space="preserve"> (Calidad / Reglamentarios):</w:t>
             </w:r>
           </w:p>
         </w:tc>
@@ -5289,7 +5313,13 @@
         </w:tc>
       </w:tr>
     </w:tbl>
-    <w:p/>
+    <w:p>
+      <w:pPr>
+        <w:tabs>
+          <w:tab w:val="left" w:pos="8229"/>
+        </w:tabs>
+      </w:pPr>
+    </w:p>
     <w:sectPr>
       <w:pgSz w:w="12240" w:h="15840"/>
       <w:pgMar w:top="1440" w:right="1440" w:bottom="1440" w:left="1440" w:header="720" w:footer="720" w:gutter="0"/>
@@ -5298,6 +5328,56 @@
     </w:sectPr>
   </w:body>
 </w:document>
+</file>
+
+<file path=word/endnotes.xml><?xml version="1.0" encoding="utf-8"?>
+<w:endnotes xmlns:wpc="http://schemas.microsoft.com/office/word/2010/wordprocessingCanvas" xmlns:cx="http://schemas.microsoft.com/office/drawing/2014/chartex" xmlns:cx1="http://schemas.microsoft.com/office/drawing/2015/9/8/chartex" xmlns:cx2="http://schemas.microsoft.com/office/drawing/2015/10/21/chartex" xmlns:cx3="http://schemas.microsoft.com/office/drawing/2016/5/9/chartex" xmlns:cx4="http://schemas.microsoft.com/office/drawing/2016/5/10/chartex" xmlns:cx5="http://schemas.microsoft.com/office/drawing/2016/5/11/chartex" xmlns:cx6="http://schemas.microsoft.com/office/drawing/2016/5/12/chartex" xmlns:cx7="http://schemas.microsoft.com/office/drawing/2016/5/13/chartex" xmlns:cx8="http://schemas.microsoft.com/office/drawing/2016/5/14/chartex" xmlns:mc="http://schemas.openxmlformats.org/markup-compatibility/2006" xmlns:aink="http://schemas.microsoft.com/office/drawing/2016/ink" xmlns:am3d="http://schemas.microsoft.com/office/drawing/2017/model3d" xmlns:o="urn:schemas-microsoft-com:office:office" xmlns:oel="http://schemas.microsoft.com/office/2019/extlst" xmlns:r="http://schemas.openxmlformats.org/officeDocument/2006/relationships" xmlns:m="http://schemas.openxmlformats.org/officeDocument/2006/math" xmlns:v="urn:schemas-microsoft-com:vml" xmlns:wp14="http://schemas.microsoft.com/office/word/2010/wordprocessingDrawing" xmlns:wp="http://schemas.openxmlformats.org/drawingml/2006/wordprocessingDrawing" xmlns:w10="urn:schemas-microsoft-com:office:word" xmlns:w="http://schemas.openxmlformats.org/wordprocessingml/2006/main" xmlns:w14="http://schemas.microsoft.com/office/word/2010/wordml" xmlns:w15="http://schemas.microsoft.com/office/word/2012/wordml" xmlns:w16cei="http://schemas.microsoft.com/office/word/2026/wordml/cei" xmlns:w16cex="http://schemas.microsoft.com/office/word/2018/wordml/cex" xmlns:w16cid="http://schemas.microsoft.com/office/word/2016/wordml/cid" xmlns:w16="http://schemas.microsoft.com/office/word/2018/wordml" xmlns:w16du="http://schemas.microsoft.com/office/word/2023/wordml/word16du" xmlns:w16sdtdh="http://schemas.microsoft.com/office/word/2020/wordml/sdtdatahash" xmlns:w16sdtfl="http://schemas.microsoft.com/office/word/2024/wordml/sdtformatlock" xmlns:w16se="http://schemas.microsoft.com/office/word/2015/wordml/symex" xmlns:wpg="http://schemas.microsoft.com/office/word/2010/wordprocessingGroup" xmlns:wpi="http://schemas.microsoft.com/office/word/2010/wordprocessingInk" xmlns:wne="http://schemas.microsoft.com/office/word/2006/wordml" xmlns:wps="http://schemas.microsoft.com/office/word/2010/wordprocessingShape" mc:Ignorable="w14 w15 w16se w16cid w16 w16cex w16sdtdh w16sdtfl w16du wp14">
+  <w:endnote w:type="separator" w:id="-1">
+    <w:p>
+      <w:pPr>
+        <w:spacing w:after="0" w:line="240" w:lineRule="auto"/>
+      </w:pPr>
+      <w:r>
+        <w:separator/>
+      </w:r>
+    </w:p>
+  </w:endnote>
+  <w:endnote w:type="continuationSeparator" w:id="0">
+    <w:p>
+      <w:pPr>
+        <w:spacing w:after="0" w:line="240" w:lineRule="auto"/>
+      </w:pPr>
+      <w:r>
+        <w:continuationSeparator/>
+      </w:r>
+    </w:p>
+  </w:endnote>
+</w:endnotes>
+</file>
+
+<file path=word/footnotes.xml><?xml version="1.0" encoding="utf-8"?>
+<w:footnotes xmlns:wpc="http://schemas.microsoft.com/office/word/2010/wordprocessingCanvas" xmlns:cx="http://schemas.microsoft.com/office/drawing/2014/chartex" xmlns:cx1="http://schemas.microsoft.com/office/drawing/2015/9/8/chartex" xmlns:cx2="http://schemas.microsoft.com/office/drawing/2015/10/21/chartex" xmlns:cx3="http://schemas.microsoft.com/office/drawing/2016/5/9/chartex" xmlns:cx4="http://schemas.microsoft.com/office/drawing/2016/5/10/chartex" xmlns:cx5="http://schemas.microsoft.com/office/drawing/2016/5/11/chartex" xmlns:cx6="http://schemas.microsoft.com/office/drawing/2016/5/12/chartex" xmlns:cx7="http://schemas.microsoft.com/office/drawing/2016/5/13/chartex" xmlns:cx8="http://schemas.microsoft.com/office/drawing/2016/5/14/chartex" xmlns:mc="http://schemas.openxmlformats.org/markup-compatibility/2006" xmlns:aink="http://schemas.microsoft.com/office/drawing/2016/ink" xmlns:am3d="http://schemas.microsoft.com/office/drawing/2017/model3d" xmlns:o="urn:schemas-microsoft-com:office:office" xmlns:oel="http://schemas.microsoft.com/office/2019/extlst" xmlns:r="http://schemas.openxmlformats.org/officeDocument/2006/relationships" xmlns:m="http://schemas.openxmlformats.org/officeDocument/2006/math" xmlns:v="urn:schemas-microsoft-com:vml" xmlns:wp14="http://schemas.microsoft.com/office/word/2010/wordprocessingDrawing" xmlns:wp="http://schemas.openxmlformats.org/drawingml/2006/wordprocessingDrawing" xmlns:w10="urn:schemas-microsoft-com:office:word" xmlns:w="http://schemas.openxmlformats.org/wordprocessingml/2006/main" xmlns:w14="http://schemas.microsoft.com/office/word/2010/wordml" xmlns:w15="http://schemas.microsoft.com/office/word/2012/wordml" xmlns:w16cei="http://schemas.microsoft.com/office/word/2026/wordml/cei" xmlns:w16cex="http://schemas.microsoft.com/office/word/2018/wordml/cex" xmlns:w16cid="http://schemas.microsoft.com/office/word/2016/wordml/cid" xmlns:w16="http://schemas.microsoft.com/office/word/2018/wordml" xmlns:w16du="http://schemas.microsoft.com/office/word/2023/wordml/word16du" xmlns:w16sdtdh="http://schemas.microsoft.com/office/word/2020/wordml/sdtdatahash" xmlns:w16sdtfl="http://schemas.microsoft.com/office/word/2024/wordml/sdtformatlock" xmlns:w16se="http://schemas.microsoft.com/office/word/2015/wordml/symex" xmlns:wpg="http://schemas.microsoft.com/office/word/2010/wordprocessingGroup" xmlns:wpi="http://schemas.microsoft.com/office/word/2010/wordprocessingInk" xmlns:wne="http://schemas.microsoft.com/office/word/2006/wordml" xmlns:wps="http://schemas.microsoft.com/office/word/2010/wordprocessingShape" mc:Ignorable="w14 w15 w16se w16cid w16 w16cex w16sdtdh w16sdtfl w16du wp14">
+  <w:footnote w:type="separator" w:id="-1">
+    <w:p>
+      <w:pPr>
+        <w:spacing w:after="0" w:line="240" w:lineRule="auto"/>
+      </w:pPr>
+      <w:r>
+        <w:separator/>
+      </w:r>
+    </w:p>
+  </w:footnote>
+  <w:footnote w:type="continuationSeparator" w:id="0">
+    <w:p>
+      <w:pPr>
+        <w:spacing w:after="0" w:line="240" w:lineRule="auto"/>
+      </w:pPr>
+      <w:r>
+        <w:continuationSeparator/>
+      </w:r>
+    </w:p>
+  </w:footnote>
+</w:footnotes>
 </file>
 
 <file path=word/numbering.xml><?xml version="1.0" encoding="utf-8"?>

</xml_diff>